<commit_message>
Marx: apuntes con la estructura del trabajo a partir de mis apuntes de clase
Co-Authored-By: Claude Opus 5.5 <noreply@anthropic.com>
Claude-Session: https://claude.ai/code/session_01Fj7SZp3YYQfX9U1XL9NLBt
</commit_message>
<xml_diff>
--- a/formacion-general/hombre-y-mundo-moderno/apuntes-word/Marx.docx
+++ b/formacion-general/hombre-y-mundo-moderno/apuntes-word/Marx.docx
@@ -25,59 +25,46 @@
     </w:p>
     <w:p>
       <w:pPr>
-        <w:spacing w:after="240"/>
-      </w:pPr>
-      <w:r>
-        <w:rPr>
-          <w:i/>
-          <w:iCs/>
-          <w:color w:val="B00000"/>
-        </w:rPr>
-        <w:t xml:space="preserve">Pendiente de revisar: de Marx todavía no tengo las diapositivas del profesor ni apuntes de clase.</w:t>
-      </w:r>
-    </w:p>
-    <w:p>
-      <w:pPr>
         <w:pStyle w:val="Heading1"/>
       </w:pPr>
       <w:r>
-        <w:t xml:space="preserve">1. Contexto</w:t>
-      </w:r>
-    </w:p>
-    <w:p>
-      <w:pPr>
-        <w:spacing w:after="160" w:line="360"/>
-        <w:jc w:val="both"/>
-      </w:pPr>
-      <w:r>
-        <w:t xml:space="preserve">Marx es uno de los tres maestros de la sospecha de Paul Ricoeur, junto con Nietzsche y Freud.</w:t>
-      </w:r>
-    </w:p>
-    <w:p>
-      <w:pPr>
-        <w:spacing w:after="160" w:line="360"/>
-        <w:jc w:val="both"/>
-      </w:pPr>
-      <w:r>
-        <w:t xml:space="preserve">Tras la caída del Sacro Imperio Romano Germánico en 1806, los territorios alemanes quedan divididos. Con el Congreso de Viena (1815) se crea la Confederación Germánica con dos polos, Prusia y Austria, en una época de restauración que reprime las ideas liberales. Prusia gana peso con el Zollverein (1834). En 1848 hay revoluciones por toda Europa que fracasan, y al final Bismarck unifica Alemania en 1871.</w:t>
-      </w:r>
-    </w:p>
-    <w:p>
-      <w:pPr>
-        <w:spacing w:after="160" w:line="360"/>
-        <w:jc w:val="both"/>
-      </w:pPr>
-      <w:r>
-        <w:t xml:space="preserve">Al mismo tiempo avanza la Revolución Industrial: aparecen las fábricas y el proletariado, que vive en la miseria, con jornadas de 14 o 16 horas y trabajo infantil.</w:t>
-      </w:r>
-    </w:p>
-    <w:p>
-      <w:pPr>
-        <w:spacing w:after="160" w:line="360"/>
-        <w:jc w:val="both"/>
-      </w:pPr>
-      <w:r>
-        <w:t xml:space="preserve">Marx nace en 1818 en Tréveris, en una familia judía que se había convertido al luteranismo. Estudia Derecho en Bonn y Berlín y se une a los jóvenes hegelianos. Trabaja como periodista hasta que le cierran el periódico. En París conoce a Engels, con quien escribe el Manifiesto comunista (1848). Después se exilia en Londres, donde vive pobre hasta su muerte en 1883 y escribe El capital (1867).</w:t>
+        <w:t xml:space="preserve">1. Contexto histórico: sitúe a Marx en su época</w:t>
+      </w:r>
+    </w:p>
+    <w:p>
+      <w:pPr>
+        <w:spacing w:after="160" w:line="360"/>
+        <w:jc w:val="both"/>
+      </w:pPr>
+      <w:r>
+        <w:t xml:space="preserve">Paul Ricoeur, en Freud: una interpretación de la cultura (1965), llama maestros de la sospecha a tres autores que nos han hecho dudar de nuestra propia conciencia: Karl Marx, Friedrich Nietzsche y Sigmund Freud. En Marx lo que se esconde detrás de lo que pensamos es la estructura económica.</w:t>
+      </w:r>
+    </w:p>
+    <w:p>
+      <w:pPr>
+        <w:spacing w:after="160" w:line="360"/>
+        <w:jc w:val="both"/>
+      </w:pPr>
+      <w:r>
+        <w:t xml:space="preserve">Tras la caída del Sacro Imperio Romano Germánico en 1806, los territorios alemanes quedan divididos. Con el Congreso de Viena (1815) se crea la Confederación Germánica, con dos polos: Prusia y Austria. Prusia gana peso con el Zollverein (1834), y en 1848 una ola de revoluciones recorre Europa, aunque fracasa. Al final Bismarck unifica Alemania en 1871. Alemania se convierte en un país puntero que avanza en la industria, y a la vez la clase obrera se ve cada vez más sometida: jornadas larguísimas, trabajo infantil y miseria en las ciudades.</w:t>
+      </w:r>
+    </w:p>
+    <w:p>
+      <w:pPr>
+        <w:spacing w:after="160" w:line="360"/>
+        <w:jc w:val="both"/>
+      </w:pPr>
+      <w:r>
+        <w:t xml:space="preserve">Marx nace en 1818 en Tréveris, en una familia judía que se había convertido al luteranismo. Estudia Derecho en Bonn y Berlín, donde se une a los jóvenes hegelianos. Trabaja como periodista hasta que le cierran el periódico, y en París conoce a Friedrich Engels, con quien escribirá buena parte de su obra. Expulsado de varios países, se instala en Londres, donde vive con muchas dificultades económicas hasta su muerte en 1883.</w:t>
+      </w:r>
+    </w:p>
+    <w:p>
+      <w:pPr>
+        <w:spacing w:after="160" w:line="360"/>
+        <w:jc w:val="both"/>
+      </w:pPr>
+      <w:r>
+        <w:t xml:space="preserve">Sus obras principales son los Manuscritos económico-filosóficos (1844), las Tesis sobre Feuerbach (1845), La ideología alemana (1846, con Engels), el Manifiesto del Partido Comunista (1848, con Engels) y El capital (1867).</w:t>
       </w:r>
     </w:p>
     <w:p>
@@ -94,25 +81,62 @@
         <w:jc w:val="both"/>
       </w:pPr>
       <w:r>
-        <w:t xml:space="preserve">Hegel decía que la historia avanza por contradicciones (dialéctica), pero lo que se desarrolla es el Espíritu. Marx coge la dialéctica pero dice que lo que mueve la historia son las condiciones materiales: es el materialismo.</w:t>
-      </w:r>
-    </w:p>
-    <w:p>
-      <w:pPr>
-        <w:spacing w:after="160" w:line="360"/>
-        <w:jc w:val="both"/>
-      </w:pPr>
-      <w:r>
-        <w:t xml:space="preserve">Feuerbach decía que Dios es una proyección del hombre, que pone en Dios lo mejor de sí mismo y queda alienado. Marx coge la idea de alienación, pero dice que no basta con explicarlo: "los filósofos solo han interpretado el mundo, de lo que se trata es de transformarlo".</w:t>
-      </w:r>
-    </w:p>
-    <w:p>
-      <w:pPr>
-        <w:spacing w:after="160" w:line="360"/>
-        <w:jc w:val="both"/>
-      </w:pPr>
-      <w:r>
-        <w:t xml:space="preserve">De Adam Smith y Ricardo coge que el valor de las cosas viene del trabajo, y de los socialistas franceses la crítica a la propiedad privada.</w:t>
+        <w:rPr>
+          <w:b/>
+          <w:bCs/>
+        </w:rPr>
+        <w:t xml:space="preserve">Hegel. </w:t>
+      </w:r>
+      <w:r>
+        <w:t xml:space="preserve">Es su gran influencia. Hegel pensaba que la historia avanza a través de contradicciones, por medio de la dialéctica, pero lo que se desarrolla en la historia es el Espíritu, las ideas. De Hegel Marx obtiene la dialéctica, pero le da la vuelta: para Marx lo que mueve la historia no son las ideas, sino las condiciones materiales, la economía.</w:t>
+      </w:r>
+    </w:p>
+    <w:p>
+      <w:pPr>
+        <w:spacing w:after="160" w:line="360"/>
+        <w:jc w:val="both"/>
+      </w:pPr>
+      <w:r>
+        <w:rPr>
+          <w:b/>
+          <w:bCs/>
+        </w:rPr>
+        <w:t xml:space="preserve">Feuerbach. </w:t>
+      </w:r>
+      <w:r>
+        <w:t xml:space="preserve">Es un pensador que critica la realidad, y sobre todo la religión. Decía que Dios no es más que una proyección del hombre: el hombre pone en Dios lo mejor de sí mismo y se queda vacío, alienado. De Feuerbach Marx hereda el materialismo y la idea de alienación. Pero le critica que se quede en explicar: "los filósofos no han hecho más que interpretar el mundo, de lo que se trata es de transformarlo".</w:t>
+      </w:r>
+    </w:p>
+    <w:p>
+      <w:pPr>
+        <w:spacing w:after="160" w:line="360"/>
+        <w:jc w:val="both"/>
+      </w:pPr>
+      <w:r>
+        <w:rPr>
+          <w:b/>
+          <w:bCs/>
+        </w:rPr>
+        <w:t xml:space="preserve">Los socialistas utópicos. </w:t>
+      </w:r>
+      <w:r>
+        <w:t xml:space="preserve">Antes de Marx había pensadores socialistas, sobre todo franceses, que criticaban la propiedad privada y querían una sociedad más justa. Marx los conocía, pero piensa que su socialismo es utópico, porque se basa en ideales y no en la realidad. Por eso él llama al suyo socialismo científico.</w:t>
+      </w:r>
+    </w:p>
+    <w:p>
+      <w:pPr>
+        <w:spacing w:after="160" w:line="360"/>
+        <w:jc w:val="both"/>
+      </w:pPr>
+      <w:r>
+        <w:rPr>
+          <w:b/>
+          <w:bCs/>
+        </w:rPr>
+        <w:t xml:space="preserve">Los economistas ingleses. </w:t>
+      </w:r>
+      <w:r>
+        <w:t xml:space="preserve">De Adam Smith y David Ricardo toma la idea de que el valor de las cosas viene del trabajo, y a partir de ahí desarrolla su teoría de la plusvalía.</w:t>
       </w:r>
     </w:p>
     <w:p>
@@ -120,43 +144,183 @@
         <w:pStyle w:val="Heading1"/>
       </w:pPr>
       <w:r>
-        <w:t xml:space="preserve">3. Síntesis de su doctrina</w:t>
-      </w:r>
-    </w:p>
-    <w:p>
-      <w:pPr>
-        <w:spacing w:after="160" w:line="360"/>
-        <w:jc w:val="both"/>
-      </w:pPr>
-      <w:r>
-        <w:t xml:space="preserve">Para Marx, antes de pensar el hombre tiene que comer y producir. La forma en que una sociedad produce (la infraestructura económica) determina todo lo demás: el derecho, la política, la moral, la religión (la superestructura). "No es la conciencia la que determina el ser, sino el ser social el que determina la conciencia." Las ideas de cada época son las de la clase dominante, y a eso lo llama ideología.</w:t>
-      </w:r>
-    </w:p>
-    <w:p>
-      <w:pPr>
-        <w:spacing w:after="160" w:line="360"/>
-        <w:jc w:val="both"/>
-      </w:pPr>
-      <w:r>
-        <w:t xml:space="preserve">La historia es la historia de la lucha de clases: esclavos y amos, siervos y señores, proletarios y burgueses.</w:t>
-      </w:r>
-    </w:p>
-    <w:p>
-      <w:pPr>
-        <w:spacing w:after="160" w:line="360"/>
-        <w:jc w:val="both"/>
-      </w:pPr>
-      <w:r>
-        <w:t xml:space="preserve">El hombre se realiza trabajando, pero en el capitalismo el trabajo se vuelve contra él: es la alienación. El obrero no es dueño de lo que produce, el trabajo es forzado, se le quita lo humano y las relaciones entre personas se vuelven relaciones entre mercancías. De ahí salen la alienación religiosa ("la religión es el opio del pueblo") y la política (el Estado es un instrumento de la clase dominante).</w:t>
-      </w:r>
-    </w:p>
-    <w:p>
-      <w:pPr>
-        <w:spacing w:after="160" w:line="360"/>
-        <w:jc w:val="both"/>
-      </w:pPr>
-      <w:r>
-        <w:t xml:space="preserve">En El capital explica la plusvalía: el obrero produce más valor del que se le paga en el salario, y esa diferencia es el beneficio del capitalista. Por eso la explotación está en el propio sistema. La solución es la revolución del proletariado, la dictadura del proletariado y al final una sociedad sin clases y sin Estado.</w:t>
+        <w:t xml:space="preserve">3. Doctrina de Marx</w:t>
+      </w:r>
+    </w:p>
+    <w:p>
+      <w:pPr>
+        <w:spacing w:after="160" w:line="360"/>
+        <w:jc w:val="both"/>
+      </w:pPr>
+      <w:r>
+        <w:rPr>
+          <w:b/>
+          <w:bCs/>
+        </w:rPr>
+        <w:t xml:space="preserve">El socialismo científico. </w:t>
+      </w:r>
+      <w:r>
+        <w:t xml:space="preserve">Aunque nosotros lo llamemos marxismo, Marx lo llamaba socialismo científico, para distinguirlo del socialismo utópico de los pensadores anteriores a él. ¿Por qué piensa que su socialismo es científico? Porque él cree saber qué va a suceder: igual que la ciencia descubre leyes de la naturaleza, él cree haber descubierto las leyes de la historia. Su socialismo científico tiene dos pilares: el materialismo y la dialéctica.</w:t>
+      </w:r>
+    </w:p>
+    <w:p>
+      <w:pPr>
+        <w:spacing w:after="160" w:line="360"/>
+        <w:jc w:val="both"/>
+      </w:pPr>
+      <w:r>
+        <w:rPr>
+          <w:b/>
+          <w:bCs/>
+        </w:rPr>
+        <w:t xml:space="preserve">El materialismo. </w:t>
+      </w:r>
+      <w:r>
+        <w:t xml:space="preserve">Lo hereda de Feuerbach. Todo lo que existe es materia y relaciones entre la materia, y todos los fenómenos se pueden explicar científicamente. Por lo tanto, ni existe ni podemos conocer una realidad trascendente, algo más allá de lo material, como Dios o el alma.</w:t>
+      </w:r>
+    </w:p>
+    <w:p>
+      <w:pPr>
+        <w:spacing w:after="160" w:line="360"/>
+        <w:jc w:val="both"/>
+      </w:pPr>
+      <w:r>
+        <w:rPr>
+          <w:b/>
+          <w:bCs/>
+        </w:rPr>
+        <w:t xml:space="preserve">La dialéctica. </w:t>
+      </w:r>
+      <w:r>
+        <w:t xml:space="preserve">Es la segunda característica, y la obtiene de Hegel. Para Marx la dialéctica es la lucha entre contrarios, y la historia se desarrolla como una lucha entre contrarios. Cada sociedad tiene su tesis, que siempre genera una antítesis, que es la negación de la tesis. La antítesis hace que la tesis esté siempre amenazada, y de esa lucha sale una síntesis, que es la integración de ambas, la negación de la negación. Y esa síntesis se convierte a su vez en una nueva tesis, y así sigue la historia.</w:t>
+      </w:r>
+    </w:p>
+    <w:p>
+      <w:pPr>
+        <w:spacing w:after="160" w:line="360"/>
+        <w:jc w:val="both"/>
+      </w:pPr>
+      <w:r>
+        <w:rPr>
+          <w:b/>
+          <w:bCs/>
+        </w:rPr>
+        <w:t xml:space="preserve">La sociedad como modo de producción. </w:t>
+      </w:r>
+      <w:r>
+        <w:t xml:space="preserve">Para Marx toda sociedad es un modo de producción. La sociedad humana se puede explicar en términos económicos: lo verdadero, lo importante y lo que lo determina todo es la estructura económica.</w:t>
+      </w:r>
+    </w:p>
+    <w:p>
+      <w:pPr>
+        <w:spacing w:after="160" w:line="360"/>
+        <w:jc w:val="both"/>
+      </w:pPr>
+      <w:r>
+        <w:rPr>
+          <w:b/>
+          <w:bCs/>
+        </w:rPr>
+        <w:t xml:space="preserve">La división del trabajo y la propiedad privada. </w:t>
+      </w:r>
+      <w:r>
+        <w:t xml:space="preserve">En un origen el modo de producción sería comunista: todos compartían todo. Pero Marx analiza que en torno al Neolítico se produce una catástrofe: la división del trabajo. Ya no todos se dedican a todo, y como cada uno se dedica a algo distinto, ya nadie recibe lo mismo. De ahí sale la mayor tragedia, que es la propiedad privada. Con la propiedad privada aparece una clase dominante, que es dueña de los medios de producción, es decir, de los medios que permiten trabajar la naturaleza para el hombre. Y aparece una clase dominada, que sobrevive gracias a vender su cuerpo y su tiempo. Así los seres humanos vivimos una vida artificial, alejada de la naturaleza.</w:t>
+      </w:r>
+    </w:p>
+    <w:p>
+      <w:pPr>
+        <w:spacing w:after="160" w:line="360"/>
+        <w:jc w:val="both"/>
+      </w:pPr>
+      <w:r>
+        <w:rPr>
+          <w:b/>
+          <w:bCs/>
+        </w:rPr>
+        <w:t xml:space="preserve">La alienación: infraestructura y superestructura. </w:t>
+      </w:r>
+      <w:r>
+        <w:t xml:space="preserve">La realidad real de las sociedades es una estructura económica, la infraestructura. Todos somos explotados y todos explotamos. Pero las sociedades tienen una capacidad natural para no reconocer su propia realidad: están alienadas, como en una especie de esquizofrenia. Las relaciones económicas pueden explicar el porqué de todo, pero no lo vemos, porque encima de ellas hay un velo. Todas las sociedades crean una estructura ideológica, la superestructura, que es un velo que decora la realidad y nos impide verla, y que hace que estemos alienados. De ella forman parte el derecho, la política, el arte y la cultura, y ante todo la religión.</w:t>
+      </w:r>
+    </w:p>
+    <w:p>
+      <w:pPr>
+        <w:spacing w:after="160" w:line="360"/>
+        <w:jc w:val="both"/>
+      </w:pPr>
+      <w:r>
+        <w:rPr>
+          <w:b/>
+          <w:bCs/>
+        </w:rPr>
+        <w:t xml:space="preserve">La religión, opio del pueblo. </w:t>
+      </w:r>
+      <w:r>
+        <w:t xml:space="preserve">Para Marx "la religión es el opio del pueblo": un consuelo que nos impide ver la realidad de las cosas. Las religiones se han construido para evitar la realidad, prometiendo en el más allá la felicidad que no se tiene aquí. Marx considera que la crítica de la religión ya está terminada, y que dando por hecho que la religión no es más que una ilusión, ya se puede criticar todo lo demás.</w:t>
+      </w:r>
+    </w:p>
+    <w:p>
+      <w:pPr>
+        <w:spacing w:after="160" w:line="360"/>
+        <w:jc w:val="both"/>
+      </w:pPr>
+      <w:r>
+        <w:rPr>
+          <w:b/>
+          <w:bCs/>
+        </w:rPr>
+        <w:t xml:space="preserve">El capitalismo, el peor de los mundos. </w:t>
+      </w:r>
+      <w:r>
+        <w:t xml:space="preserve">Esta dialéctica, la lucha de clases a lo largo de la historia, nos ha conducido al peor de los mundos posibles: el capitalismo. Las clases antiguas, el clero y la nobleza, han desaparecido, y de las ciudades ha salido la sociedad burguesa moderna, que es la que ha instaurado el capitalismo. ¿Por qué el capitalismo es el peor de los mundos? Porque la burguesía ya se ha emancipado de la esquizofrenia en la que vivían las sociedades anteriores. Ya saben cómo funciona el mundo, y lo primero de todo, ya no creen en Dios: saben que el mundo es puramente económico. La burguesía es crítica, científica y sabe cómo ser lo más eficiente posible. Ya no necesita el velo de la religión para explotar.</w:t>
+      </w:r>
+    </w:p>
+    <w:p>
+      <w:pPr>
+        <w:spacing w:after="160" w:line="360"/>
+        <w:jc w:val="both"/>
+      </w:pPr>
+      <w:r>
+        <w:rPr>
+          <w:b/>
+          <w:bCs/>
+        </w:rPr>
+        <w:t xml:space="preserve">Burguesía contra proletariado. </w:t>
+      </w:r>
+      <w:r>
+        <w:t xml:space="preserve">Como consecuencia, cada vez hay menos ricos, que son más ricos, y cada vez hay más pobres, que son más pobres. ¿Por qué? Porque la burguesía usa todos sus poderes económicos para aumentar al máximo su plusvalía, que es la diferencia entre lo que produce el obrero y lo que se le paga, y así cada vez crece más su beneficio. ¿Cómo lo hace? Con la libertad de mercado. La burguesía no tiene límites: sabe cómo funciona el mundo y controla el mercado, y cuando ya no puede crecer más dentro de su país, expande los mercados a nivel internacional. La sociedad se divide en dos clases enfrentadas: burguesía y proletariado.</w:t>
+      </w:r>
+    </w:p>
+    <w:p>
+      <w:pPr>
+        <w:spacing w:after="160" w:line="360"/>
+        <w:jc w:val="both"/>
+      </w:pPr>
+      <w:r>
+        <w:rPr>
+          <w:b/>
+          <w:bCs/>
+        </w:rPr>
+        <w:t xml:space="preserve">El partido comunista y la revolución. </w:t>
+      </w:r>
+      <w:r>
+        <w:t xml:space="preserve">¿Cuál es el único camino que le queda al proletariado? El partido comunista, no los socialistas, porque para Marx los socialistas son utópicos, se basan en irrealidades. Lo que Marx tiene claro es que el capitalismo va a explotar: esa será la síntesis. Y ahí el proletariado tiene que intervenir y aprovechar ese crack para salir del capitalismo. El partido comunista es la vanguardia del proletariado: siempre lo va a representar, sin quedarse en un punto medio. Los comunistas tienen sobre el resto del proletariado la ventaja de ser visionarios, saben hacia dónde va el futuro, y tienen que ser los profetas del proletariado. Tienen que alzar la revolución y ser los más agresivos para levantar la revuelta y promover la conciencia de clase, es decir, que el proletariado sienta en el corazón que está siendo explotado. Y esto por cualquier medio, incluso la violencia, con tal de derrocar el orden burgués.</w:t>
+      </w:r>
+    </w:p>
+    <w:p>
+      <w:pPr>
+        <w:spacing w:after="160" w:line="360"/>
+        <w:jc w:val="both"/>
+      </w:pPr>
+      <w:r>
+        <w:rPr>
+          <w:b/>
+          <w:bCs/>
+        </w:rPr>
+        <w:t xml:space="preserve">La dictadura del proletariado y el paraíso comunista. </w:t>
+      </w:r>
+      <w:r>
+        <w:t xml:space="preserve">Una vez que el partido comunista lo logre, habrá una fase de dictadura del proletariado, en la que hay que desmantelar el orden burgués y abolir la propiedad privada. Cuando el proletariado haya tomado el poder, vendrá el paraíso comunista, y ahí empezaría la verdadera historia de la humanidad. El poder ya no se usará para la opresión: los que lo tengan serán puros gestores. Desaparecerá definitivamente la propiedad privada y se producirá la emancipación del hombre en general.</w:t>
       </w:r>
     </w:p>
     <w:p>
@@ -164,25 +328,55 @@
         <w:pStyle w:val="Heading1"/>
       </w:pPr>
       <w:r>
-        <w:t xml:space="preserve">4. Relación con Sartre</w:t>
-      </w:r>
-    </w:p>
-    <w:p>
-      <w:pPr>
-        <w:spacing w:after="160" w:line="360"/>
-        <w:jc w:val="both"/>
-      </w:pPr>
-      <w:r>
-        <w:t xml:space="preserve">Sartre se acerca al marxismo y en la Crítica de la razón dialéctica (1960) intenta unirlo con el existencialismo. Los dos son ateos, los dos dicen que no hay una naturaleza humana fija (para Marx la esencia humana es el conjunto de las relaciones sociales, para Sartre la existencia precede a la esencia) y los dos dan importancia a la acción. Además el marxismo (Althusser, el maoísmo) influyó en Mayo del 68.</w:t>
-      </w:r>
-    </w:p>
-    <w:p>
-      <w:pPr>
-        <w:spacing w:after="160" w:line="360"/>
-        <w:jc w:val="both"/>
-      </w:pPr>
-      <w:r>
-        <w:t xml:space="preserve">La diferencia es que para Sartre la libertad es absoluta y para Marx la conciencia está determinada por la economía. Sartre parte del individuo y Marx de las clases.</w:t>
+        <w:t xml:space="preserve">4. Relación con otros autores</w:t>
+      </w:r>
+    </w:p>
+    <w:p>
+      <w:pPr>
+        <w:spacing w:after="160" w:line="360"/>
+        <w:jc w:val="both"/>
+      </w:pPr>
+      <w:r>
+        <w:rPr>
+          <w:b/>
+          <w:bCs/>
+        </w:rPr>
+        <w:t xml:space="preserve">Marx y Nietzsche. </w:t>
+      </w:r>
+      <w:r>
+        <w:t xml:space="preserve">Los dos son maestros de la sospecha: detrás de la moral y de la religión hay algo oculto, los intereses económicos para Marx y la voluntad de poder para Nietzsche. Los dos critican la religión: para Marx es el opio del pueblo y para Nietzsche Dios ha muerto. Pero están en lados opuestos. Marx defiende a los oprimidos y quiere una sociedad sin clases, mientras que Nietzsche admira a los fuertes y a los aristócratas, y para él el socialismo es una forma más del resentimiento de los débiles, igual que el cristianismo.</w:t>
+      </w:r>
+    </w:p>
+    <w:p>
+      <w:pPr>
+        <w:spacing w:after="160" w:line="360"/>
+        <w:jc w:val="both"/>
+      </w:pPr>
+      <w:r>
+        <w:rPr>
+          <w:b/>
+          <w:bCs/>
+        </w:rPr>
+        <w:t xml:space="preserve">Marx y Freud. </w:t>
+      </w:r>
+      <w:r>
+        <w:t xml:space="preserve">Los dos piensan que la conciencia no dice la verdad sobre sí misma. Para Marx lo que hay debajo son las relaciones económicas, que crean una ideología, y para Freud el inconsciente individual. Marx incluso habla de la alienación como una especie de esquizofrenia de la sociedad. Los dos ven la religión como algo que hay que superar: el opio del pueblo para Marx y una ilusión infantil para Freud. La diferencia es que Marx busca liberar a la sociedad con la revolución y Freud curar al individuo con el psicoanálisis.</w:t>
+      </w:r>
+    </w:p>
+    <w:p>
+      <w:pPr>
+        <w:spacing w:after="160" w:line="360"/>
+        <w:jc w:val="both"/>
+      </w:pPr>
+      <w:r>
+        <w:rPr>
+          <w:b/>
+          <w:bCs/>
+        </w:rPr>
+        <w:t xml:space="preserve">Marx y Sartre. </w:t>
+      </w:r>
+      <w:r>
+        <w:t xml:space="preserve">Sartre se acerca al marxismo al final de su vida, y en la Crítica de la razón dialéctica (1960) intenta unirlo con el existencialismo. Los dos son ateos, los dos piensan que no hay una naturaleza humana fija y los dos dan mucha importancia a la acción y al compromiso. Además el marxismo, en especial el maoísmo de Althusser, fue una de las influencias de Mayo del 68. La diferencia es que para Marx la conciencia está determinada por la economía, mientras que para Sartre la libertad es absoluta: Marx parte de las clases y Sartre del individuo.</w:t>
       </w:r>
     </w:p>
     <w:p>
@@ -199,25 +393,52 @@
         <w:jc w:val="both"/>
       </w:pPr>
       <w:r>
-        <w:t xml:space="preserve">Marx acierta al denunciar la explotación de los obreros y al dar valor al trabajo. Pero si todas las ideas son ideología de una clase, el marxismo también lo sería.</w:t>
-      </w:r>
-    </w:p>
-    <w:p>
-      <w:pPr>
-        <w:spacing w:after="160" w:line="360"/>
-        <w:jc w:val="both"/>
-      </w:pPr>
-      <w:r>
-        <w:t xml:space="preserve">El problema principal es decir que el hombre es el conjunto de sus relaciones sociales. Para que haya relaciones tiene que haber alguien que se relacione. Aristóteles distingue entre sustancia y accidentes, y la relación es un accidente. Si el individuo es solo un conjunto de relaciones, lo que importa es la clase y el colectivo, y la persona se puede sacrificar por la historia, como pasó en los regímenes comunistas del siglo XX.</w:t>
-      </w:r>
-    </w:p>
-    <w:p>
-      <w:pPr>
-        <w:spacing w:after="160" w:line="360"/>
-        <w:jc w:val="both"/>
-      </w:pPr>
-      <w:r>
-        <w:t xml:space="preserve">Ser humano es todo miembro de la especie homo sapiens sapiens. Persona es un ser único e irrepetible con dignidad. La palabra viene del teatro y en Roma solo eran personas los hombres libres, romanos y paterfamilias, no los esclavos. Santo Tomás coge la definición de Boecio: sustancia individual de naturaleza racional. Como la persona va unida al ser y no a su clase ni a lo que produce, tiene una dignidad ontológica, y justo por eso explotarla es injusto: una persona no es una mercancía.</w:t>
+        <w:t xml:space="preserve">Desde mi punto de vista, Marx acierta al denunciar la explotación de los obreros en el capitalismo industrial de su tiempo y al dar valor al trabajo. Pero su doctrina no se puede asumir, y el primer problema está en su propio planteamiento. Marx dice que todas las ideas son parte de una superestructura ideológica que esconde la realidad económica. Pero entonces su propia teoría también sería ideología. Si todo lo que pensamos está determinado por la economía, ¿cómo puede Marx salir del velo para verlo y explicárnoslo? Además, llama científico a su socialismo porque cree saber lo que va a pasar, pero el capitalismo no ha explotado como él decía.</w:t>
+      </w:r>
+    </w:p>
+    <w:p>
+      <w:pPr>
+        <w:spacing w:after="160" w:line="360"/>
+        <w:jc w:val="both"/>
+      </w:pPr>
+      <w:r>
+        <w:t xml:space="preserve">El segundo problema es el materialismo. Para Marx todo es materia y no existe nada trascendente. Pero, como explica Aristóteles, el ser se dice de muchas maneras y hay grados de ser: los seres inertes son; los seres vivos son y viven; y los seres humanos son, viven y entienden. La inteligencia no es materia ni economía, sino el ser de los seres vivos inteligentes. Reducir al ser humano a lo que produce es tratarlo como si solo fuera materia.</w:t>
+      </w:r>
+    </w:p>
+    <w:p>
+      <w:pPr>
+        <w:spacing w:after="160" w:line="360"/>
+        <w:jc w:val="both"/>
+      </w:pPr>
+      <w:r>
+        <w:t xml:space="preserve">El tercer problema es su idea del ser humano. Para Marx el hombre se define por su lugar en las relaciones de producción, por su clase. Pero Aristóteles distingue entre la sustancia, que es lo que subsiste en sí mismo, y los accidentes, entre los que está la relación. Para que haya relaciones tiene que haber alguien que se relacione. Si el hombre es solo un conjunto de relaciones económicas, lo que importa es la clase, y el individuo se puede sacrificar por ella.</w:t>
+      </w:r>
+    </w:p>
+    <w:p>
+      <w:pPr>
+        <w:spacing w:after="160" w:line="360"/>
+        <w:jc w:val="both"/>
+      </w:pPr>
+      <w:r>
+        <w:t xml:space="preserve">Esto tiene consecuencias graves. Si el fin, el paraíso comunista, lo justifica todo, se puede usar cualquier medio, incluso la violencia y la dictadura, y el burgués deja de ser una persona para convertirse en un enemigo. Es lo que pasó en los regímenes comunistas del siglo XX. Además, es curioso que Marx, que critica la religión, acabe construyendo algo parecido: unos profetas, que son el partido comunista, y un paraíso al final de la historia.</w:t>
+      </w:r>
+    </w:p>
+    <w:p>
+      <w:pPr>
+        <w:spacing w:after="160" w:line="360"/>
+        <w:jc w:val="both"/>
+      </w:pPr>
+      <w:r>
+        <w:t xml:space="preserve">Ser humano es todo miembro de la especie homo sapiens sapiens. Persona es un ser único e irrepetible, con dignidad. La palabra viene del teatro, donde la persona era la máscara o el personaje, y antiguamente no todos se consideraban personas: en Roma solo el hombre libre, romano y paterfamilias, y no los esclavos. Es decir, ser persona dependía de la posición social, justo lo que Marx criticaría. Santo Tomás de Aquino coge la definición de Boecio: persona es una sustancia individual de naturaleza racional.</w:t>
+      </w:r>
+    </w:p>
+    <w:p>
+      <w:pPr>
+        <w:spacing w:after="160" w:line="360"/>
+        <w:jc w:val="both"/>
+      </w:pPr>
+      <w:r>
+        <w:t xml:space="preserve">Por tanto la persona va necesariamente unida al ser, y no a su clase ni a lo que produce, y de ahí existe la dignidad humana: sin ser no existe. Es una dignidad ontológica, que se tiene por el simple hecho de ser. Y precisamente por eso la explotación es injusta: una persona no es una mercancía. Los seres humanos somos racionales y libres.</w:t>
       </w:r>
     </w:p>
     <w:p>
@@ -243,85 +464,202 @@
         <w:spacing w:after="100" w:line="320"/>
       </w:pPr>
       <w:r>
-        <w:t xml:space="preserve">Contexto: Sacro Imperio (1806), Congreso de Viena, Zollverein, revoluciones de 1848, Revolución Industrial y proletariado.</w:t>
-      </w:r>
-    </w:p>
-    <w:p>
-      <w:pPr>
-        <w:pStyle w:val="ListParagraph"/>
-        <w:numPr>
-          <w:ilvl w:val="0"/>
-          <w:numId w:val="2"/>
-        </w:numPr>
-        <w:spacing w:after="100" w:line="320"/>
-      </w:pPr>
-      <w:r>
-        <w:t xml:space="preserve">Obras: Manifiesto comunista (1848), El capital (1867).</w:t>
-      </w:r>
-    </w:p>
-    <w:p>
-      <w:pPr>
-        <w:pStyle w:val="ListParagraph"/>
-        <w:numPr>
-          <w:ilvl w:val="0"/>
-          <w:numId w:val="2"/>
-        </w:numPr>
-        <w:spacing w:after="100" w:line="320"/>
-      </w:pPr>
-      <w:r>
-        <w:t xml:space="preserve">Influencias: Hegel (dialéctica), Feuerbach (alienación), Smith y Ricardo (valor-trabajo).</w:t>
-      </w:r>
-    </w:p>
-    <w:p>
-      <w:pPr>
-        <w:pStyle w:val="ListParagraph"/>
-        <w:numPr>
-          <w:ilvl w:val="0"/>
-          <w:numId w:val="2"/>
-        </w:numPr>
-        <w:spacing w:after="100" w:line="320"/>
-      </w:pPr>
-      <w:r>
-        <w:t xml:space="preserve">Infraestructura determina superestructura. Ideología. Lucha de clases.</w:t>
-      </w:r>
-    </w:p>
-    <w:p>
-      <w:pPr>
-        <w:pStyle w:val="ListParagraph"/>
-        <w:numPr>
-          <w:ilvl w:val="0"/>
-          <w:numId w:val="2"/>
-        </w:numPr>
-        <w:spacing w:after="100" w:line="320"/>
-      </w:pPr>
-      <w:r>
-        <w:t xml:space="preserve">Alienación: económica, religiosa (opio del pueblo), política.</w:t>
-      </w:r>
-    </w:p>
-    <w:p>
-      <w:pPr>
-        <w:pStyle w:val="ListParagraph"/>
-        <w:numPr>
-          <w:ilvl w:val="0"/>
-          <w:numId w:val="2"/>
-        </w:numPr>
-        <w:spacing w:after="100" w:line="320"/>
-      </w:pPr>
-      <w:r>
-        <w:t xml:space="preserve">Plusvalía → explotación → revolución → sociedad sin clases.</w:t>
-      </w:r>
-    </w:p>
-    <w:p>
-      <w:pPr>
-        <w:pStyle w:val="ListParagraph"/>
-        <w:numPr>
-          <w:ilvl w:val="0"/>
-          <w:numId w:val="2"/>
-        </w:numPr>
-        <w:spacing w:after="100" w:line="320"/>
-      </w:pPr>
-      <w:r>
-        <w:t xml:space="preserve">Crítica: se contradice; la relación es un accidente; persona = sustancia individual → dignidad ontológica.</w:t>
+        <w:t xml:space="preserve">Maestro de la sospecha (Ricoeur): lo oculto es la estructura económica.</w:t>
+      </w:r>
+    </w:p>
+    <w:p>
+      <w:pPr>
+        <w:pStyle w:val="ListParagraph"/>
+        <w:numPr>
+          <w:ilvl w:val="0"/>
+          <w:numId w:val="2"/>
+        </w:numPr>
+        <w:spacing w:after="100" w:line="320"/>
+      </w:pPr>
+      <w:r>
+        <w:t xml:space="preserve">Contexto: Sacro Imperio (1806), Congreso de Viena, Zollverein, revoluciones de 1848, unificación (1871); Alemania puntera en la industria y clase obrera cada vez más sometida.</w:t>
+      </w:r>
+    </w:p>
+    <w:p>
+      <w:pPr>
+        <w:pStyle w:val="ListParagraph"/>
+        <w:numPr>
+          <w:ilvl w:val="0"/>
+          <w:numId w:val="2"/>
+        </w:numPr>
+        <w:spacing w:after="100" w:line="320"/>
+      </w:pPr>
+      <w:r>
+        <w:t xml:space="preserve">Bio: Tréveris (1818), familia judía convertida; jóvenes hegelianos; periodista; Engels; Londres; muere en 1883.</w:t>
+      </w:r>
+    </w:p>
+    <w:p>
+      <w:pPr>
+        <w:pStyle w:val="ListParagraph"/>
+        <w:numPr>
+          <w:ilvl w:val="0"/>
+          <w:numId w:val="2"/>
+        </w:numPr>
+        <w:spacing w:after="100" w:line="320"/>
+      </w:pPr>
+      <w:r>
+        <w:t xml:space="preserve">Obras: Manuscritos (1844), Tesis sobre Feuerbach (1845), La ideología alemana (1846), Manifiesto comunista (1848), El capital (1867).</w:t>
+      </w:r>
+    </w:p>
+    <w:p>
+      <w:pPr>
+        <w:pStyle w:val="ListParagraph"/>
+        <w:numPr>
+          <w:ilvl w:val="0"/>
+          <w:numId w:val="2"/>
+        </w:numPr>
+        <w:spacing w:after="100" w:line="320"/>
+      </w:pPr>
+      <w:r>
+        <w:t xml:space="preserve">Precedentes: Hegel (dialéctica), Feuerbach (materialismo, alienación), socialistas utópicos, Smith y Ricardo (valor-trabajo).</w:t>
+      </w:r>
+    </w:p>
+    <w:p>
+      <w:pPr>
+        <w:pStyle w:val="ListParagraph"/>
+        <w:numPr>
+          <w:ilvl w:val="0"/>
+          <w:numId w:val="2"/>
+        </w:numPr>
+        <w:spacing w:after="100" w:line="320"/>
+      </w:pPr>
+      <w:r>
+        <w:t xml:space="preserve">Socialismo científico (no utópico): cree saber qué va a pasar. Dos pilares: materialismo (todo es materia; nada trascendente) y dialéctica (tesis → antítesis → síntesis = negación de la negación).</w:t>
+      </w:r>
+    </w:p>
+    <w:p>
+      <w:pPr>
+        <w:pStyle w:val="ListParagraph"/>
+        <w:numPr>
+          <w:ilvl w:val="0"/>
+          <w:numId w:val="2"/>
+        </w:numPr>
+        <w:spacing w:after="100" w:line="320"/>
+      </w:pPr>
+      <w:r>
+        <w:t xml:space="preserve">Toda sociedad es un modo de producción; lo determinante es la estructura económica.</w:t>
+      </w:r>
+    </w:p>
+    <w:p>
+      <w:pPr>
+        <w:pStyle w:val="ListParagraph"/>
+        <w:numPr>
+          <w:ilvl w:val="0"/>
+          <w:numId w:val="2"/>
+        </w:numPr>
+        <w:spacing w:after="100" w:line="320"/>
+      </w:pPr>
+      <w:r>
+        <w:t xml:space="preserve">Origen comunista → Neolítico: división del trabajo → propiedad privada → clase dominante (medios de producción) / clase dominada (vende su cuerpo y su tiempo).</w:t>
+      </w:r>
+    </w:p>
+    <w:p>
+      <w:pPr>
+        <w:pStyle w:val="ListParagraph"/>
+        <w:numPr>
+          <w:ilvl w:val="0"/>
+          <w:numId w:val="2"/>
+        </w:numPr>
+        <w:spacing w:after="100" w:line="320"/>
+      </w:pPr>
+      <w:r>
+        <w:t xml:space="preserve">Infraestructura (economía) / superestructura (ideología = velo). Alienación = esquizofrenia de la sociedad.</w:t>
+      </w:r>
+    </w:p>
+    <w:p>
+      <w:pPr>
+        <w:pStyle w:val="ListParagraph"/>
+        <w:numPr>
+          <w:ilvl w:val="0"/>
+          <w:numId w:val="2"/>
+        </w:numPr>
+        <w:spacing w:after="100" w:line="320"/>
+      </w:pPr>
+      <w:r>
+        <w:t xml:space="preserve">La religión es el opio del pueblo.</w:t>
+      </w:r>
+    </w:p>
+    <w:p>
+      <w:pPr>
+        <w:pStyle w:val="ListParagraph"/>
+        <w:numPr>
+          <w:ilvl w:val="0"/>
+          <w:numId w:val="2"/>
+        </w:numPr>
+        <w:spacing w:after="100" w:line="320"/>
+      </w:pPr>
+      <w:r>
+        <w:t xml:space="preserve">Capitalismo = el peor de los mundos: la burguesía ya no cree en Dios, es crítica, científica, eficiente.</w:t>
+      </w:r>
+    </w:p>
+    <w:p>
+      <w:pPr>
+        <w:pStyle w:val="ListParagraph"/>
+        <w:numPr>
+          <w:ilvl w:val="0"/>
+          <w:numId w:val="2"/>
+        </w:numPr>
+        <w:spacing w:after="100" w:line="320"/>
+      </w:pPr>
+      <w:r>
+        <w:t xml:space="preserve">Burguesía vs proletariado: plusvalía, libertad de mercado, mercados internacionales; ricos más ricos, pobres más pobres.</w:t>
+      </w:r>
+    </w:p>
+    <w:p>
+      <w:pPr>
+        <w:pStyle w:val="ListParagraph"/>
+        <w:numPr>
+          <w:ilvl w:val="0"/>
+          <w:numId w:val="2"/>
+        </w:numPr>
+        <w:spacing w:after="100" w:line="320"/>
+      </w:pPr>
+      <w:r>
+        <w:t xml:space="preserve">Partido comunista = vanguardia y profetas del proletariado; conciencia de clase; revolución, incluso con violencia, cuando el capitalismo explote.</w:t>
+      </w:r>
+    </w:p>
+    <w:p>
+      <w:pPr>
+        <w:pStyle w:val="ListParagraph"/>
+        <w:numPr>
+          <w:ilvl w:val="0"/>
+          <w:numId w:val="2"/>
+        </w:numPr>
+        <w:spacing w:after="100" w:line="320"/>
+      </w:pPr>
+      <w:r>
+        <w:t xml:space="preserve">Dictadura del proletariado → abolir la propiedad privada → paraíso comunista: verdadera historia de la humanidad, emancipación del hombre.</w:t>
+      </w:r>
+    </w:p>
+    <w:p>
+      <w:pPr>
+        <w:pStyle w:val="ListParagraph"/>
+        <w:numPr>
+          <w:ilvl w:val="0"/>
+          <w:numId w:val="2"/>
+        </w:numPr>
+        <w:spacing w:after="100" w:line="320"/>
+      </w:pPr>
+      <w:r>
+        <w:t xml:space="preserve">Relaciones: Nietzsche (sospecha; socialismo = resentimiento), Freud (conciencia engañada; religión), Sartre (Crítica de la razón dialéctica; Mayo del 68).</w:t>
+      </w:r>
+    </w:p>
+    <w:p>
+      <w:pPr>
+        <w:pStyle w:val="ListParagraph"/>
+        <w:numPr>
+          <w:ilvl w:val="0"/>
+          <w:numId w:val="2"/>
+        </w:numPr>
+        <w:spacing w:after="100" w:line="320"/>
+      </w:pPr>
+      <w:r>
+        <w:t xml:space="preserve">Crítica: si todo es ideología, también su teoría; el capitalismo no ha explotado; materialismo vs grados de ser; la relación es un accidente; el fin justifica los medios; profetas y paraíso; persona (Boecio) → dignidad ontológica.</w:t>
       </w:r>
     </w:p>
     <w:sectPr>

</xml_diff>

<commit_message>
Marx: completa los apuntes con la presentación del profesor
Co-Authored-By: Claude Opus 5.5 <noreply@anthropic.com>
Claude-Session: https://claude.ai/code/session_01Fj7SZp3YYQfX9U1XL9NLBt
</commit_message>
<xml_diff>
--- a/formacion-general/hombre-y-mundo-moderno/apuntes-word/Marx.docx
+++ b/formacion-general/hombre-y-mundo-moderno/apuntes-word/Marx.docx
@@ -55,16 +55,16 @@
         <w:jc w:val="both"/>
       </w:pPr>
       <w:r>
-        <w:t xml:space="preserve">Marx nace en 1818 en Tréveris, en una familia judía que se había convertido al luteranismo. Estudia Derecho en Bonn y Berlín, donde se une a los jóvenes hegelianos. Trabaja como periodista hasta que le cierran el periódico, y en París conoce a Friedrich Engels, con quien escribirá buena parte de su obra. Expulsado de varios países, se instala en Londres, donde vive con muchas dificultades económicas hasta su muerte en 1883.</w:t>
-      </w:r>
-    </w:p>
-    <w:p>
-      <w:pPr>
-        <w:spacing w:after="160" w:line="360"/>
-        <w:jc w:val="both"/>
-      </w:pPr>
-      <w:r>
-        <w:t xml:space="preserve">Sus obras principales son los Manuscritos económico-filosóficos (1844), las Tesis sobre Feuerbach (1845), La ideología alemana (1846, con Engels), el Manifiesto del Partido Comunista (1848, con Engels) y El capital (1867).</w:t>
+        <w:t xml:space="preserve">Marx nace en 1818 en Tréveris (Prusia), en una familia judía; su padre se convirtió oficialmente al cristianismo protestante. Empieza a estudiar Derecho en Bonn, sin éxito, y en la Universidad de Berlín empieza Filosofía y se une a los jóvenes hegelianos de izquierda, en torno a Feuerbach y Bruno Bauer. En 1841 defiende su tesis doctoral y en 1842 participa en la Gaceta Renana, en Colonia. En 1843 se casa con Jenny von Westphalen y, tras el cierre del periódico, se muda a París, donde se interesa por los socialistas franceses (Saint-Simon, Cabet, Fourier) y por los economistas ingleses (Adam Smith, David Ricardo). En 1844 conoce a Friedrich Engels. Tras pasar por Bruselas, se traslada con Engels a Londres; en 1848 nace la Liga de los Comunistas y participa en la revolución de ese año. En 1849 se instala definitivamente en Londres. En 1864 se involucra en la Asociación Internacional del Trabajo (I Internacional), de la que logra expulsar al anarquista Bakunin, y vive la Comuna de París (1871). Muere en 1883.</w:t>
+      </w:r>
+    </w:p>
+    <w:p>
+      <w:pPr>
+        <w:spacing w:after="160" w:line="360"/>
+        <w:jc w:val="both"/>
+      </w:pPr>
+      <w:r>
+        <w:t xml:space="preserve">Sus obras principales son La diferencia de la filosofía de la naturaleza en Demócrito y Epicuro (1841, su tesis), Sobre la cuestión judía (1843), Crítica de la filosofía del derecho de Hegel (1843), Manuscritos económicos y filosóficos (1844), La sagrada familia (1845), Tesis sobre Feuerbach (1845), La ideología alemana (escrita en 1845-46 y publicada en 1932), La miseria de la filosofía (1847), Manifiesto del Partido Comunista (1848), El 18 de brumario de Luis Bonaparte (1851-52), Contribución a la crítica de la economía política (1859), el libro I de El capital (1867) y Crítica del programa de Gotha (publicada en 1891).</w:t>
       </w:r>
     </w:p>
     <w:p>
@@ -88,39 +88,39 @@
         <w:t xml:space="preserve">Hegel. </w:t>
       </w:r>
       <w:r>
-        <w:t xml:space="preserve">Es su gran influencia. Hegel pensaba que la historia avanza a través de contradicciones, por medio de la dialéctica, pero lo que se desarrolla en la historia es el Espíritu, las ideas. De Hegel Marx obtiene la dialéctica, pero le da la vuelta: para Marx lo que mueve la historia no son las ideas, sino las condiciones materiales, la economía.</w:t>
-      </w:r>
-    </w:p>
-    <w:p>
-      <w:pPr>
-        <w:spacing w:after="160" w:line="360"/>
-        <w:jc w:val="both"/>
-      </w:pPr>
-      <w:r>
-        <w:rPr>
-          <w:b/>
-          <w:bCs/>
-        </w:rPr>
-        <w:t xml:space="preserve">Feuerbach. </w:t>
-      </w:r>
-      <w:r>
-        <w:t xml:space="preserve">Es un pensador que critica la realidad, y sobre todo la religión. Decía que Dios no es más que una proyección del hombre: el hombre pone en Dios lo mejor de sí mismo y se queda vacío, alienado. De Feuerbach Marx hereda el materialismo y la idea de alienación. Pero le critica que se quede en explicar: "los filósofos no han hecho más que interpretar el mundo, de lo que se trata es de transformarlo".</w:t>
-      </w:r>
-    </w:p>
-    <w:p>
-      <w:pPr>
-        <w:spacing w:after="160" w:line="360"/>
-        <w:jc w:val="both"/>
-      </w:pPr>
-      <w:r>
-        <w:rPr>
-          <w:b/>
-          <w:bCs/>
-        </w:rPr>
-        <w:t xml:space="preserve">Los socialistas utópicos. </w:t>
-      </w:r>
-      <w:r>
-        <w:t xml:space="preserve">Antes de Marx había pensadores socialistas, sobre todo franceses, que criticaban la propiedad privada y querían una sociedad más justa. Marx los conocía, pero piensa que su socialismo es utópico, porque se basa en ideales y no en la realidad. Por eso él llama al suyo socialismo científico.</w:t>
+        <w:t xml:space="preserve">Es su gran influencia. Hegel pensaba que la realidad es un proceso dialéctico: cada momento contiene dentro de sí su propia negación, y así se eleva a un estadio superior que es una síntesis de lo anterior. Pero para Hegel lo que se desarrolla en la historia es el Espíritu, las ideas. Marx obtiene de él la dialéctica, pero le da la vuelta: lo que mueve la historia no son las ideas, sino las condiciones materiales.</w:t>
+      </w:r>
+    </w:p>
+    <w:p>
+      <w:pPr>
+        <w:spacing w:after="160" w:line="360"/>
+        <w:jc w:val="both"/>
+      </w:pPr>
+      <w:r>
+        <w:rPr>
+          <w:b/>
+          <w:bCs/>
+        </w:rPr>
+        <w:t xml:space="preserve">Feuerbach y los jóvenes hegelianos. </w:t>
+      </w:r>
+      <w:r>
+        <w:t xml:space="preserve">En Berlín Marx se une a los jóvenes hegelianos de izquierda, en torno a Feuerbach y Bruno Bauer. Feuerbach es un pensador que critica la realidad, y sobre todo la religión: Dios no es más que una proyección del hombre, que pone en Dios lo mejor de sí mismo y se queda alienado. De Feuerbach Marx hereda el materialismo y la idea de alienación. Pero le reprocha que se quede en explicar: "los filósofos no han hecho más que interpretar el mundo, de lo que se trata es de transformarlo".</w:t>
+      </w:r>
+    </w:p>
+    <w:p>
+      <w:pPr>
+        <w:spacing w:after="160" w:line="360"/>
+        <w:jc w:val="both"/>
+      </w:pPr>
+      <w:r>
+        <w:rPr>
+          <w:b/>
+          <w:bCs/>
+        </w:rPr>
+        <w:t xml:space="preserve">Los socialistas franceses. </w:t>
+      </w:r>
+      <w:r>
+        <w:t xml:space="preserve">En París Marx conoce el pensamiento de Saint-Simon, Cabet y Fourier, que criticaban la propiedad privada y querían una sociedad más justa. Marx piensa que su socialismo es utópico, porque se basa en ideales y no en la realidad, y por eso él llama al suyo socialismo científico.</w:t>
       </w:r>
     </w:p>
     <w:p>
@@ -136,7 +136,7 @@
         <w:t xml:space="preserve">Los economistas ingleses. </w:t>
       </w:r>
       <w:r>
-        <w:t xml:space="preserve">De Adam Smith y David Ricardo toma la idea de que el valor de las cosas viene del trabajo, y a partir de ahí desarrolla su teoría de la plusvalía.</w:t>
+        <w:t xml:space="preserve">De Adam Smith y David Ricardo toma la pregunta de por qué las cosas valen lo que valen. Para ellos el valor natural de una cosa viene del trabajo, directo e indirecto, y ese valor se reparte entre el beneficio del empresario, la renta del terrateniente y el salario del trabajador. Marx parte de aquí para desarrollar su teoría de la plusvalía.</w:t>
       </w:r>
     </w:p>
     <w:p>
@@ -160,7 +160,7 @@
         <w:t xml:space="preserve">El socialismo científico. </w:t>
       </w:r>
       <w:r>
-        <w:t xml:space="preserve">Aunque nosotros lo llamemos marxismo, Marx lo llamaba socialismo científico, para distinguirlo del socialismo utópico de los pensadores anteriores a él. ¿Por qué piensa que su socialismo es científico? Porque él cree saber qué va a suceder: igual que la ciencia descubre leyes de la naturaleza, él cree haber descubierto las leyes de la historia. Su socialismo científico tiene dos pilares: el materialismo y la dialéctica.</w:t>
+        <w:t xml:space="preserve">Aunque nosotros lo llamemos marxismo, Marx lo llamaba socialismo científico, para distinguirlo del socialismo utópico de los pensadores anteriores a él. ¿Por qué piensa que su socialismo es científico? Porque él cree saber qué va a suceder: igual que la ciencia descubre las leyes de la naturaleza, él cree haber descubierto las leyes de la historia. Su doctrina es el materialismo dialéctico, y tiene dos pilares: el materialismo y la dialéctica.</w:t>
       </w:r>
     </w:p>
     <w:p>
@@ -176,7 +176,7 @@
         <w:t xml:space="preserve">El materialismo. </w:t>
       </w:r>
       <w:r>
-        <w:t xml:space="preserve">Lo hereda de Feuerbach. Todo lo que existe es materia y relaciones entre la materia, y todos los fenómenos se pueden explicar científicamente. Por lo tanto, ni existe ni podemos conocer una realidad trascendente, algo más allá de lo material, como Dios o el alma.</w:t>
+        <w:t xml:space="preserve">Lo hereda de Feuerbach. Toda la realidad conocida es materia y relaciones entre la materia, y todos los fenómenos se pueden explicar en términos científicos. Por lo tanto, ni existe ni podemos conocer una realidad trascendente. Nociones como el alma, el espíritu o la conciencia no son independientes de la materia, sino subproductos de ella. Por eso Marx dice: "no es la conciencia de los hombres lo que determina su ser, sino, por el contrario, es su existencia social lo que determina su conciencia".</w:t>
       </w:r>
     </w:p>
     <w:p>
@@ -192,7 +192,7 @@
         <w:t xml:space="preserve">La dialéctica. </w:t>
       </w:r>
       <w:r>
-        <w:t xml:space="preserve">Es la segunda característica, y la obtiene de Hegel. Para Marx la dialéctica es la lucha entre contrarios, y la historia se desarrolla como una lucha entre contrarios. Cada sociedad tiene su tesis, que siempre genera una antítesis, que es la negación de la tesis. La antítesis hace que la tesis esté siempre amenazada, y de esa lucha sale una síntesis, que es la integración de ambas, la negación de la negación. Y esa síntesis se convierte a su vez en una nueva tesis, y así sigue la historia.</w:t>
+        <w:t xml:space="preserve">Es la segunda característica, y la obtiene de Hegel. Para Marx la dialéctica es la lucha entre contrarios, y la historia se desarrolla como un conflicto entre opuestos. En cada sociedad hay una tesis, lo que está dado, que siempre genera una antítesis, que es la negación de la tesis y la tiene siempre amenazada. De esa lucha sale una síntesis, que integra a ambas: es la negación de la negación. Por ejemplo, en Roma la tesis eran los patricios y la antítesis los plebeyos, y de su lucha salió una sociedad nueva, la feudal. En el feudalismo la tesis eran el clero y la nobleza y la antítesis los siervos de la gleba, y de ahí salió el capitalismo, con la burguesía y el proletariado. Por eso "la historia de todas las sociedades anteriores a la nuestra es la historia de la lucha de clases".</w:t>
       </w:r>
     </w:p>
     <w:p>
@@ -208,7 +208,7 @@
         <w:t xml:space="preserve">La sociedad como modo de producción. </w:t>
       </w:r>
       <w:r>
-        <w:t xml:space="preserve">Para Marx toda sociedad es un modo de producción. La sociedad humana se puede explicar en términos económicos: lo verdadero, lo importante y lo que lo determina todo es la estructura económica.</w:t>
+        <w:t xml:space="preserve">Para Marx toda sociedad es un modo de producción. En la producción de su existencia, los hombres establecen relaciones de producción que no dependen de su voluntad. Esas relaciones forman la estructura económica de la sociedad, que es la base real sobre la que se levanta todo lo demás: el derecho, la política y las formas de conciencia. Es decir, la sociedad humana se puede explicar en términos económicos, y lo verdadero y lo que lo determina todo es la estructura económica.</w:t>
       </w:r>
     </w:p>
     <w:p>
@@ -224,7 +224,23 @@
         <w:t xml:space="preserve">La división del trabajo y la propiedad privada. </w:t>
       </w:r>
       <w:r>
-        <w:t xml:space="preserve">En un origen el modo de producción sería comunista: todos compartían todo. Pero Marx analiza que en torno al Neolítico se produce una catástrofe: la división del trabajo. Ya no todos se dedican a todo, y como cada uno se dedica a algo distinto, ya nadie recibe lo mismo. De ahí sale la mayor tragedia, que es la propiedad privada. Con la propiedad privada aparece una clase dominante, que es dueña de los medios de producción, es decir, de los medios que permiten trabajar la naturaleza para el hombre. Y aparece una clase dominada, que sobrevive gracias a vender su cuerpo y su tiempo. Así los seres humanos vivimos una vida artificial, alejada de la naturaleza.</w:t>
+        <w:t xml:space="preserve">En un origen el modo de producción sería un comunismo tribal: todos compartían todo. Pero Marx analiza que en torno al Neolítico se produce una catástrofe: la división del trabajo. Ya no todos se dedican a todo, y como cada uno se dedica a algo distinto, ya nadie recibe lo mismo: el trabajo y sus productos se reparten de forma desigual. De ahí sale la mayor tragedia, que es la propiedad privada de los medios de producción, cuyo primer germen está ya en la familia, donde la mujer y los hijos son como esclavos del marido. Para Marx división del trabajo y propiedad privada son lo mismo, una dicha de la actividad y la otra de su producto. Con la propiedad privada aparece una clase dominante, los propietarios de los medios de producción, es decir, de los medios que permiten trabajar la naturaleza para el hombre. Y aparece una clase dominada, los desposeídos, que sobreviven gracias a vender su cuerpo y su tiempo. Los propietarios viven como humanidad, libres; los dominados quedan reducidos a naturaleza, a un medio más. Así los seres humanos vivimos una vida artificial.</w:t>
+      </w:r>
+    </w:p>
+    <w:p>
+      <w:pPr>
+        <w:spacing w:after="160" w:line="360"/>
+        <w:jc w:val="both"/>
+      </w:pPr>
+      <w:r>
+        <w:rPr>
+          <w:b/>
+          <w:bCs/>
+        </w:rPr>
+        <w:t xml:space="preserve">La plusvalía. </w:t>
+      </w:r>
+      <w:r>
+        <w:t xml:space="preserve">¿Por qué las cosas valen lo que valen? Para los economistas ingleses el valor natural de una cosa venía del trabajo y se repartía entre el beneficio del empresario, la renta del terrateniente y el salario del trabajador. Marx dice que en realidad todo el valor lo produce el trabajo, pero al trabajador solo se le paga un salario, y la diferencia entre lo que produce y lo que cobra se la queda el burgués: es la plusvalía.</w:t>
       </w:r>
     </w:p>
     <w:p>
@@ -240,7 +256,7 @@
         <w:t xml:space="preserve">La alienación: infraestructura y superestructura. </w:t>
       </w:r>
       <w:r>
-        <w:t xml:space="preserve">La realidad real de las sociedades es una estructura económica, la infraestructura. Todos somos explotados y todos explotamos. Pero las sociedades tienen una capacidad natural para no reconocer su propia realidad: están alienadas, como en una especie de esquizofrenia. Las relaciones económicas pueden explicar el porqué de todo, pero no lo vemos, porque encima de ellas hay un velo. Todas las sociedades crean una estructura ideológica, la superestructura, que es un velo que decora la realidad y nos impide verla, y que hace que estemos alienados. De ella forman parte el derecho, la política, el arte y la cultura, y ante todo la religión.</w:t>
+        <w:t xml:space="preserve">Marx se pregunta: ¿por qué los oprimidos no se rebelan?, ¿por qué estamos condenados a repetir rebeliones parciales que no resuelven el problema de raíz? Porque las sociedades viven una especie de esquizofrenia: la alienación. La realidad real de las sociedades es la infraestructura económica, el modo de producción, la materia y las relaciones materiales. Todos somos explotados y todos explotamos. Pero encima de ella las sociedades crean una superestructura ideológica, que es un velo que decora la realidad y nos impide verla. La moral, la religión, la metafísica, la política, el arte, la cultura y el ocio forman parte de ella, y aunque parecen autónomos, en realidad dependen de la actividad material de los hombres.</w:t>
       </w:r>
     </w:p>
     <w:p>
@@ -256,23 +272,23 @@
         <w:t xml:space="preserve">La religión, opio del pueblo. </w:t>
       </w:r>
       <w:r>
-        <w:t xml:space="preserve">Para Marx "la religión es el opio del pueblo": un consuelo que nos impide ver la realidad de las cosas. Las religiones se han construido para evitar la realidad, prometiendo en el más allá la felicidad que no se tiene aquí. Marx considera que la crítica de la religión ya está terminada, y que dando por hecho que la religión no es más que una ilusión, ya se puede criticar todo lo demás.</w:t>
-      </w:r>
-    </w:p>
-    <w:p>
-      <w:pPr>
-        <w:spacing w:after="160" w:line="360"/>
-        <w:jc w:val="both"/>
-      </w:pPr>
-      <w:r>
-        <w:rPr>
-          <w:b/>
-          <w:bCs/>
-        </w:rPr>
-        <w:t xml:space="preserve">El capitalismo, el peor de los mundos. </w:t>
-      </w:r>
-      <w:r>
-        <w:t xml:space="preserve">Esta dialéctica, la lucha de clases a lo largo de la historia, nos ha conducido al peor de los mundos posibles: el capitalismo. Las clases antiguas, el clero y la nobleza, han desaparecido, y de las ciudades ha salido la sociedad burguesa moderna, que es la que ha instaurado el capitalismo. ¿Por qué el capitalismo es el peor de los mundos? Porque la burguesía ya se ha emancipado de la esquizofrenia en la que vivían las sociedades anteriores. Ya saben cómo funciona el mundo, y lo primero de todo, ya no creen en Dios: saben que el mundo es puramente económico. La burguesía es crítica, científica y sabe cómo ser lo más eficiente posible. Ya no necesita el velo de la religión para explotar.</w:t>
+        <w:t xml:space="preserve">Ante todo, de la superestructura forma parte la religión: "la religión es el opio del pueblo". Es un consuelo que nos impide ver la realidad de las cosas, porque promete en el más allá la felicidad que no se tiene aquí. Las religiones se han construido para evitar la realidad.</w:t>
+      </w:r>
+    </w:p>
+    <w:p>
+      <w:pPr>
+        <w:spacing w:after="160" w:line="360"/>
+        <w:jc w:val="both"/>
+      </w:pPr>
+      <w:r>
+        <w:rPr>
+          <w:b/>
+          <w:bCs/>
+        </w:rPr>
+        <w:t xml:space="preserve">El capitalismo, el peor sistema posible. </w:t>
+      </w:r>
+      <w:r>
+        <w:t xml:space="preserve">La lucha de clases a lo largo de la historia nos ha conducido al capitalismo. La sociedad burguesa moderna, que salió de la decadencia de la sociedad feudal, no ha acabado con los antagonismos de clase, sino que ha puesto clases nuevas y nuevas formas de opresión. ¿Por qué es el peor sistema posible? Porque la burguesía ya se ha emancipado de la esquizofrenia de las sociedades anteriores: ya sabe cómo funciona el mundo y, lo primero de todo, ya no cree en Dios. Como dice Marx, "para Alemania, la crítica de la religión está terminada y la crítica de la religión es la premisa de toda crítica". La burguesía sabe que el mundo es puramente económico, es crítica, científica e hipereficiente en la producción, y ya no necesita el velo de la religión para explotar.</w:t>
       </w:r>
     </w:p>
     <w:p>
@@ -288,7 +304,7 @@
         <w:t xml:space="preserve">Burguesía contra proletariado. </w:t>
       </w:r>
       <w:r>
-        <w:t xml:space="preserve">Como consecuencia, cada vez hay menos ricos, que son más ricos, y cada vez hay más pobres, que son más pobres. ¿Por qué? Porque la burguesía usa todos sus poderes económicos para aumentar al máximo su plusvalía, que es la diferencia entre lo que produce el obrero y lo que se le paga, y así cada vez crece más su beneficio. ¿Cómo lo hace? Con la libertad de mercado. La burguesía no tiene límites: sabe cómo funciona el mundo y controla el mercado, y cuando ya no puede crecer más dentro de su país, expande los mercados a nivel internacional. La sociedad se divide en dos clases enfrentadas: burguesía y proletariado.</w:t>
+        <w:t xml:space="preserve">Como consecuencia, cada vez hay menos ricos, con mayor riqueza, y cada vez más pobres, con mayor pobreza. La sociedad entera se divide en dos grandes clases enfrentadas: la burguesía y el proletariado. La burguesía explota al proletariado de forma descarnada: reduce el salario al mínimo y se apropia de la plusvalía para aumentar al máximo su beneficio. Lo hace con la libertad de mercado, y como no tiene límites, cuando ya no puede crecer más en su país expande los mercados a nivel internacional, creando imperios coloniales.</w:t>
       </w:r>
     </w:p>
     <w:p>
@@ -304,7 +320,7 @@
         <w:t xml:space="preserve">El partido comunista y la revolución. </w:t>
       </w:r>
       <w:r>
-        <w:t xml:space="preserve">¿Cuál es el único camino que le queda al proletariado? El partido comunista, no los socialistas, porque para Marx los socialistas son utópicos, se basan en irrealidades. Lo que Marx tiene claro es que el capitalismo va a explotar: esa será la síntesis. Y ahí el proletariado tiene que intervenir y aprovechar ese crack para salir del capitalismo. El partido comunista es la vanguardia del proletariado: siempre lo va a representar, sin quedarse en un punto medio. Los comunistas tienen sobre el resto del proletariado la ventaja de ser visionarios, saben hacia dónde va el futuro, y tienen que ser los profetas del proletariado. Tienen que alzar la revolución y ser los más agresivos para levantar la revuelta y promover la conciencia de clase, es decir, que el proletariado sienta en el corazón que está siendo explotado. Y esto por cualquier medio, incluso la violencia, con tal de derrocar el orden burgués.</w:t>
+        <w:t xml:space="preserve">¿Cuál es el único camino que le queda al proletariado? El partido comunista. No sirven los socialistas burgueses (filántropos, reformadores, organizadores de beneficencia), que quieren mejorar la situación de los obreros pero sin cambiar la sociedad burguesa, ni los socialistas utópicos, que se basan en irrealidades. El proletariado es algo nuevo: todos los movimientos anteriores eran de minorías, y este es el movimiento de la inmensa mayoría en provecho de la inmensa mayoría. Lo que Marx tiene claro es que el capitalismo va a explotar, y que el proletariado tiene que aprovechar ese crack para salir de él. El partido comunista es la vanguardia del proletariado: la parte más decidida, que siempre empuja hacia delante, y que tiene sobre el resto del proletariado la ventaja de saber hacia dónde va el movimiento. Son como los profetas del proletariado. Su tarea es promover la conciencia de clase, que el proletariado sienta que está siendo explotado, y apoyar cualquier movimiento revolucionario para derrocar el orden burgués por cualquier medio, incluso la violencia: "las clases dominantes pueden temblar ante una revolución comunista".</w:t>
       </w:r>
     </w:p>
     <w:p>
@@ -320,7 +336,7 @@
         <w:t xml:space="preserve">La dictadura del proletariado y el paraíso comunista. </w:t>
       </w:r>
       <w:r>
-        <w:t xml:space="preserve">Una vez que el partido comunista lo logre, habrá una fase de dictadura del proletariado, en la que hay que desmantelar el orden burgués y abolir la propiedad privada. Cuando el proletariado haya tomado el poder, vendrá el paraíso comunista, y ahí empezaría la verdadera historia de la humanidad. El poder ya no se usará para la opresión: los que lo tengan serán puros gestores. Desaparecerá definitivamente la propiedad privada y se producirá la emancipación del hombre en general.</w:t>
+        <w:t xml:space="preserve">Para Marx todo lo anterior es la prehistoria de la humanidad. Cuando el partido comunista y el proletariado tomen el poder, habrá una fase intermedia, la dictadura del proletariado, cuyo fin es abolir la propiedad privada, nacionalizar los medios de producción y reprimir a los sectores reaccionarios. Después llegará el paraíso comunista, y ahí empezará la auténtica historia de la humanidad. Al desaparecer las clases, el poder ya no tendrá carácter político, porque para Marx el poder político es el poder organizado de una clase para oprimir a otra: los que lo tengan serán puros gestores. Desaparecerá definitivamente la propiedad privada, se acabará la escasez y se producirá la emancipación del hombre en general, con el lema: "¡de cada cual según sus capacidades, a cada cual según sus necesidades!".</w:t>
       </w:r>
     </w:p>
     <w:p>
@@ -490,33 +506,33 @@
         <w:spacing w:after="100" w:line="320"/>
       </w:pPr>
       <w:r>
-        <w:t xml:space="preserve">Bio: Tréveris (1818), familia judía convertida; jóvenes hegelianos; periodista; Engels; Londres; muere en 1883.</w:t>
-      </w:r>
-    </w:p>
-    <w:p>
-      <w:pPr>
-        <w:pStyle w:val="ListParagraph"/>
-        <w:numPr>
-          <w:ilvl w:val="0"/>
-          <w:numId w:val="2"/>
-        </w:numPr>
-        <w:spacing w:after="100" w:line="320"/>
-      </w:pPr>
-      <w:r>
-        <w:t xml:space="preserve">Obras: Manuscritos (1844), Tesis sobre Feuerbach (1845), La ideología alemana (1846), Manifiesto comunista (1848), El capital (1867).</w:t>
-      </w:r>
-    </w:p>
-    <w:p>
-      <w:pPr>
-        <w:pStyle w:val="ListParagraph"/>
-        <w:numPr>
-          <w:ilvl w:val="0"/>
-          <w:numId w:val="2"/>
-        </w:numPr>
-        <w:spacing w:after="100" w:line="320"/>
-      </w:pPr>
-      <w:r>
-        <w:t xml:space="preserve">Precedentes: Hegel (dialéctica), Feuerbach (materialismo, alienación), socialistas utópicos, Smith y Ricardo (valor-trabajo).</w:t>
+        <w:t xml:space="preserve">Bio: Tréveris (1818), familia judía, padre protestante; Bonn (fracaso), Berlín, jóvenes hegelianos (Feuerbach, Bruno Bauer); Gaceta Renana (1842); Jenny von Westphalen (1843); París; Engels (1844); Londres; Liga de los Comunistas y revolución (1848); I Internacional (1864, expulsa a Bakunin); Comuna de París (1871); muere en 1883.</w:t>
+      </w:r>
+    </w:p>
+    <w:p>
+      <w:pPr>
+        <w:pStyle w:val="ListParagraph"/>
+        <w:numPr>
+          <w:ilvl w:val="0"/>
+          <w:numId w:val="2"/>
+        </w:numPr>
+        <w:spacing w:after="100" w:line="320"/>
+      </w:pPr>
+      <w:r>
+        <w:t xml:space="preserve">Obras: Sobre la cuestión judía (1843), Crítica de la filosofía del derecho de Hegel (1843), Manuscritos (1844), Tesis sobre Feuerbach (1845), La ideología alemana, Manifiesto comunista (1848), Contribución a la crítica de la economía política (1859), El capital (1867), Crítica del programa de Gotha.</w:t>
+      </w:r>
+    </w:p>
+    <w:p>
+      <w:pPr>
+        <w:pStyle w:val="ListParagraph"/>
+        <w:numPr>
+          <w:ilvl w:val="0"/>
+          <w:numId w:val="2"/>
+        </w:numPr>
+        <w:spacing w:after="100" w:line="320"/>
+      </w:pPr>
+      <w:r>
+        <w:t xml:space="preserve">Precedentes: Hegel (dialéctica), Feuerbach y Bruno Bauer (materialismo, alienación), socialistas franceses (Saint-Simon, Cabet, Fourier: utópicos), Smith y Ricardo (valor-trabajo).</w:t>
       </w:r>
     </w:p>
     <w:p>
@@ -555,7 +571,33 @@
         <w:spacing w:after="100" w:line="320"/>
       </w:pPr>
       <w:r>
+        <w:t xml:space="preserve">Dialéctica histórica: patricios/plebeyos → feudalismo (clero y nobleza / siervos de la gleba) → capitalismo (burguesía / proletariado).</w:t>
+      </w:r>
+    </w:p>
+    <w:p>
+      <w:pPr>
+        <w:pStyle w:val="ListParagraph"/>
+        <w:numPr>
+          <w:ilvl w:val="0"/>
+          <w:numId w:val="2"/>
+        </w:numPr>
+        <w:spacing w:after="100" w:line="320"/>
+      </w:pPr>
+      <w:r>
         <w:t xml:space="preserve">Origen comunista → Neolítico: división del trabajo → propiedad privada → clase dominante (medios de producción) / clase dominada (vende su cuerpo y su tiempo).</w:t>
+      </w:r>
+    </w:p>
+    <w:p>
+      <w:pPr>
+        <w:pStyle w:val="ListParagraph"/>
+        <w:numPr>
+          <w:ilvl w:val="0"/>
+          <w:numId w:val="2"/>
+        </w:numPr>
+        <w:spacing w:after="100" w:line="320"/>
+      </w:pPr>
+      <w:r>
+        <w:t xml:space="preserve">Plusvalía: todo el valor lo produce el trabajo; el burgués se queda la diferencia con el salario.</w:t>
       </w:r>
     </w:p>
     <w:p>

</xml_diff>

<commit_message>
Marx: une y acorta el contexto histórico y la biografía
Co-Authored-By: Claude Opus 5.5 <noreply@anthropic.com>
Claude-Session: https://claude.ai/code/session_01Fj7SZp3YYQfX9U1XL9NLBt
</commit_message>
<xml_diff>
--- a/formacion-general/hombre-y-mundo-moderno/apuntes-word/Marx.docx
+++ b/formacion-general/hombre-y-mundo-moderno/apuntes-word/Marx.docx
@@ -46,16 +46,7 @@
         <w:jc w:val="both"/>
       </w:pPr>
       <w:r>
-        <w:t xml:space="preserve">Tras la caída del Sacro Imperio Romano Germánico en 1806, los territorios alemanes quedan divididos. Con el Congreso de Viena (1815) se crea la Confederación Germánica, con dos polos: Prusia y Austria. Prusia gana peso con el Zollverein (1834), y en 1848 una ola de revoluciones recorre Europa, aunque fracasa. Al final Bismarck unifica Alemania en 1871. Alemania se convierte en un país puntero que avanza en la industria, y a la vez la clase obrera se ve cada vez más sometida: jornadas larguísimas, trabajo infantil y miseria en las ciudades.</w:t>
-      </w:r>
-    </w:p>
-    <w:p>
-      <w:pPr>
-        <w:spacing w:after="160" w:line="360"/>
-        <w:jc w:val="both"/>
-      </w:pPr>
-      <w:r>
-        <w:t xml:space="preserve">Marx nace en 1818 en Tréveris (Prusia), en una familia judía; su padre se convirtió oficialmente al cristianismo protestante. Empieza a estudiar Derecho en Bonn, sin éxito, y en la Universidad de Berlín empieza Filosofía y se une a los jóvenes hegelianos de izquierda, en torno a Feuerbach y Bruno Bauer. En 1841 defiende su tesis doctoral y en 1842 participa en la Gaceta Renana, en Colonia. En 1843 se casa con Jenny von Westphalen y, tras el cierre del periódico, se muda a París, donde se interesa por los socialistas franceses (Saint-Simon, Cabet, Fourier) y por los economistas ingleses (Adam Smith, David Ricardo). En 1844 conoce a Friedrich Engels. Tras pasar por Bruselas, se traslada con Engels a Londres; en 1848 nace la Liga de los Comunistas y participa en la revolución de ese año. En 1849 se instala definitivamente en Londres. En 1864 se involucra en la Asociación Internacional del Trabajo (I Internacional), de la que logra expulsar al anarquista Bakunin, y vive la Comuna de París (1871). Muere en 1883.</w:t>
+        <w:t xml:space="preserve">Marx nace en 1818 en Tréveris, en una Alemania todavía dividida tras la caída del Sacro Imperio Romano Germánico (1806). Tras el Congreso de Viena (1815), los territorios alemanes quedan agrupados en la Confederación Germánica, dividida entre dos potencias rivales: Prusia y Austria. Prusia se fortalece con el Zollverein (1834) y, aunque las revoluciones de 1848 fracasan, Bismarck acaba unificando Alemania en 1871. Alemania se convierte en una potencia industrial, pero a costa de una clase obrera cada vez más sometida, con jornadas interminables, trabajo infantil y miseria en las ciudades. En este contexto vive Marx. De familia judía, estudia Filosofía en Berlín, donde se une a los jóvenes hegelianos en torno a Feuerbach. Tras trabajar como periodista se marcha a París, donde conoce el socialismo francés, la economía inglesa y a Friedrich Engels, con quien escribe el Manifiesto comunista en el año de las revoluciones de 1848. Después se instala en Londres, donde vive hasta su muerte en 1883.</w:t>
       </w:r>
     </w:p>
     <w:p>
@@ -493,20 +484,20 @@
         <w:spacing w:after="100" w:line="320"/>
       </w:pPr>
       <w:r>
-        <w:t xml:space="preserve">Contexto: Sacro Imperio (1806), Congreso de Viena, Zollverein, revoluciones de 1848, unificación (1871); Alemania puntera en la industria y clase obrera cada vez más sometida.</w:t>
-      </w:r>
-    </w:p>
-    <w:p>
-      <w:pPr>
-        <w:pStyle w:val="ListParagraph"/>
-        <w:numPr>
-          <w:ilvl w:val="0"/>
-          <w:numId w:val="2"/>
-        </w:numPr>
-        <w:spacing w:after="100" w:line="320"/>
-      </w:pPr>
-      <w:r>
-        <w:t xml:space="preserve">Bio: Tréveris (1818), familia judía, padre protestante; Bonn (fracaso), Berlín, jóvenes hegelianos (Feuerbach, Bruno Bauer); Gaceta Renana (1842); Jenny von Westphalen (1843); París; Engels (1844); Londres; Liga de los Comunistas y revolución (1848); I Internacional (1864, expulsa a Bakunin); Comuna de París (1871); muere en 1883.</w:t>
+        <w:t xml:space="preserve">Contexto: Alemania dividida tras el Sacro Imperio (1806), Confederación Germánica (Prusia vs Austria), Zollverein (1834), revoluciones de 1848, unificación con Bismarck (1871); potencia industrial y clase obrera sometida.</w:t>
+      </w:r>
+    </w:p>
+    <w:p>
+      <w:pPr>
+        <w:pStyle w:val="ListParagraph"/>
+        <w:numPr>
+          <w:ilvl w:val="0"/>
+          <w:numId w:val="2"/>
+        </w:numPr>
+        <w:spacing w:after="100" w:line="320"/>
+      </w:pPr>
+      <w:r>
+        <w:t xml:space="preserve">Bio: Tréveris (1818), familia judía; jóvenes hegelianos en Berlín (Feuerbach); periodista; París (socialistas franceses, economía inglesa, Engels); Manifiesto (1848); Londres hasta su muerte (1883).</w:t>
       </w:r>
     </w:p>
     <w:p>

</xml_diff>

<commit_message>
Marx: deja solo las tres obras principales
Co-Authored-By: Claude Opus 5.5 <noreply@anthropic.com>
Claude-Session: https://claude.ai/code/session_01Fj7SZp3YYQfX9U1XL9NLBt
</commit_message>
<xml_diff>
--- a/formacion-general/hombre-y-mundo-moderno/apuntes-word/Marx.docx
+++ b/formacion-general/hombre-y-mundo-moderno/apuntes-word/Marx.docx
@@ -55,7 +55,7 @@
         <w:jc w:val="both"/>
       </w:pPr>
       <w:r>
-        <w:t xml:space="preserve">Sus obras principales son La diferencia de la filosofía de la naturaleza en Demócrito y Epicuro (1841, su tesis), Sobre la cuestión judía (1843), Crítica de la filosofía del derecho de Hegel (1843), Manuscritos económicos y filosóficos (1844), La sagrada familia (1845), Tesis sobre Feuerbach (1845), La ideología alemana (escrita en 1845-46 y publicada en 1932), La miseria de la filosofía (1847), Manifiesto del Partido Comunista (1848), El 18 de brumario de Luis Bonaparte (1851-52), Contribución a la crítica de la economía política (1859), el libro I de El capital (1867) y Crítica del programa de Gotha (publicada en 1891).</w:t>
+        <w:t xml:space="preserve">Sus tres obras más importantes son el Manifiesto del Partido Comunista (1848), escrito con Engels, donde expone la lucha de clases y el papel del partido comunista; la Contribución a la crítica de la economía política (1859), donde explica que la estructura económica determina la conciencia; y El capital (1867), donde analiza el capitalismo y la plusvalía.</w:t>
       </w:r>
     </w:p>
     <w:p>
@@ -510,7 +510,7 @@
         <w:spacing w:after="100" w:line="320"/>
       </w:pPr>
       <w:r>
-        <w:t xml:space="preserve">Obras: Sobre la cuestión judía (1843), Crítica de la filosofía del derecho de Hegel (1843), Manuscritos (1844), Tesis sobre Feuerbach (1845), La ideología alemana, Manifiesto comunista (1848), Contribución a la crítica de la economía política (1859), El capital (1867), Crítica del programa de Gotha.</w:t>
+        <w:t xml:space="preserve">Obras: Manifiesto del Partido Comunista (1848), Contribución a la crítica de la economía política (1859), El capital (1867).</w:t>
       </w:r>
     </w:p>
     <w:p>

</xml_diff>